<commit_message>
Formatting fixes for template
</commit_message>
<xml_diff>
--- a/api/src/templates/information-sharing-agreements/confidentiality-acknowledgement-template.docx
+++ b/api/src/templates/information-sharing-agreements/confidentiality-acknowledgement-template.docx
@@ -1598,7 +1598,7 @@
       </w:pPr>
       <w:r>
         <w:rPr/>
-        <w:t>{external_group_contact.external_organization.name}</w:t>
+        <w:t xml:space="preserve">{external_group_contact.external_organization.name} </w:t>
       </w:r>
       <w:r>
         <w:rPr>
@@ -1752,7 +1752,7 @@
       </w:pPr>
       <w:r>
         <w:rPr/>
-        <w:t>{external_group_contact.external_organization.name}</w:t>
+        <w:t xml:space="preserve">{external_group_contact.external_organization.name} </w:t>
       </w:r>
       <w:r>
         <w:rPr>

</xml_diff>

<commit_message>
:fire: Trim ISA optional sections to match the new template.
- Drop detail level, formats, credit line, expiration notification and breach action fields, which the new template no longer asks
- Keep compelled disclosure as question 5 and add {disclosure_notes} to the Word template
- Add migration dropping the nine removed columns

Co-Authored-By: Claude Sonnet 5 <noreply@anthropic.com>
</commit_message>
<xml_diff>
--- a/api/src/templates/information-sharing-agreements/confidentiality-acknowledgement-template.docx
+++ b/api/src/templates/information-sharing-agreements/confidentiality-acknowledgement-template.docx
@@ -2379,6 +2379,7 @@
     <w:p>
       <w:pPr>
         <w:pStyle w:val="Normal"/>
+        <w:bidi w:val="0"/>
         <w:ind w:start="-720" w:end="-432"/>
         <w:rPr>
           <w:rFonts w:ascii="Nunito Sans" w:hAnsi="Nunito Sans"/>
@@ -2392,91 +2393,7 @@
           <w:bCs/>
           <w:lang w:val="en-CA"/>
         </w:rPr>
-      </w:r>
-    </w:p>
-    <w:p>
-      <w:pPr>
-        <w:pStyle w:val="Normal"/>
-        <w:pBdr>
-          <w:top w:val="single" w:sz="6" w:space="1" w:color="000000"/>
-        </w:pBdr>
-        <w:ind w:start="-720" w:end="-432"/>
-        <w:rPr>
-          <w:rFonts w:ascii="Nunito Sans" w:hAnsi="Nunito Sans"/>
-          <w:bCs/>
-          <w:lang w:val="en-CA"/>
-        </w:rPr>
-      </w:pPr>
-      <w:r>
-        <w:rPr>
-          <w:rFonts w:ascii="Nunito Sans" w:hAnsi="Nunito Sans"/>
-          <w:bCs/>
-          <w:lang w:val="en-CA"/>
-        </w:rPr>
-      </w:r>
-    </w:p>
-    <w:p>
-      <w:pPr>
-        <w:pStyle w:val="Normal"/>
-        <w:pBdr>
-          <w:top w:val="single" w:sz="6" w:space="1" w:color="000000"/>
-        </w:pBdr>
-        <w:ind w:start="-720" w:end="-432"/>
-        <w:rPr>
-          <w:rFonts w:ascii="Nunito Sans" w:hAnsi="Nunito Sans"/>
-          <w:bCs/>
-          <w:lang w:val="en-CA"/>
-        </w:rPr>
-      </w:pPr>
-      <w:r>
-        <w:rPr>
-          <w:rFonts w:ascii="Nunito Sans" w:hAnsi="Nunito Sans"/>
-          <w:bCs/>
-          <w:lang w:val="en-CA"/>
-        </w:rPr>
-      </w:r>
-    </w:p>
-    <w:p>
-      <w:pPr>
-        <w:pStyle w:val="Normal"/>
-        <w:pBdr>
-          <w:top w:val="single" w:sz="6" w:space="1" w:color="000000"/>
-        </w:pBdr>
-        <w:ind w:start="-720" w:end="-432"/>
-        <w:rPr>
-          <w:rFonts w:ascii="Nunito Sans" w:hAnsi="Nunito Sans"/>
-          <w:bCs/>
-          <w:lang w:val="en-CA"/>
-        </w:rPr>
-      </w:pPr>
-      <w:r>
-        <w:rPr>
-          <w:rFonts w:ascii="Nunito Sans" w:hAnsi="Nunito Sans"/>
-          <w:bCs/>
-          <w:lang w:val="en-CA"/>
-        </w:rPr>
-      </w:r>
-    </w:p>
-    <w:p>
-      <w:pPr>
-        <w:pStyle w:val="Normal"/>
-        <w:pBdr>
-          <w:top w:val="single" w:sz="6" w:space="1" w:color="000000"/>
-          <w:bottom w:val="single" w:sz="6" w:space="1" w:color="000000"/>
-        </w:pBdr>
-        <w:ind w:start="-720" w:end="-432"/>
-        <w:rPr>
-          <w:rFonts w:ascii="Nunito Sans" w:hAnsi="Nunito Sans"/>
-          <w:bCs/>
-          <w:lang w:val="en-CA"/>
-        </w:rPr>
-      </w:pPr>
-      <w:r>
-        <w:rPr>
-          <w:rFonts w:ascii="Nunito Sans" w:hAnsi="Nunito Sans"/>
-          <w:bCs/>
-          <w:lang w:val="en-CA"/>
-        </w:rPr>
+        <w:t>{disclosure_notes}</w:t>
       </w:r>
     </w:p>
     <w:p>

</xml_diff>